<commit_message>
Final touches to the report
</commit_message>
<xml_diff>
--- a/US_Accidents_Severity_Report.docx
+++ b/US_Accidents_Severity_Report.docx
@@ -207,11 +207,33 @@
       <w:pPr>
         <w:jc w:val="center"/>
       </w:pPr>
-      <w:r>
-        <w:rPr>
-          <w:color w:val="000000"/>
-        </w:rPr>
-        <w:t>CatBoost Binary Classifier (GPU-accelerated, Google Colab)</w:t>
+      <w:proofErr w:type="spellStart"/>
+      <w:r>
+        <w:rPr>
+          <w:color w:val="000000"/>
+        </w:rPr>
+        <w:t>CatBoost</w:t>
+      </w:r>
+      <w:proofErr w:type="spellEnd"/>
+      <w:r>
+        <w:rPr>
+          <w:color w:val="000000"/>
+        </w:rPr>
+        <w:t xml:space="preserve"> Binary Classifier (GPU-accelerated, Google </w:t>
+      </w:r>
+      <w:proofErr w:type="spellStart"/>
+      <w:r>
+        <w:rPr>
+          <w:color w:val="000000"/>
+        </w:rPr>
+        <w:t>Colab</w:t>
+      </w:r>
+      <w:proofErr w:type="spellEnd"/>
+      <w:r>
+        <w:rPr>
+          <w:color w:val="000000"/>
+        </w:rPr>
+        <w:t>)</w:t>
       </w:r>
     </w:p>
     <w:p>
@@ -265,7 +287,19 @@
         <w:rPr>
           <w:color w:val="000000"/>
         </w:rPr>
-        <w:t xml:space="preserve"> has four levels (1–4), but the distribution is extremely skewed: severity 2 accounts for ~80% of records while severity 4</w:t>
+        <w:t xml:space="preserve"> has four levels (1</w:t>
+      </w:r>
+      <w:r>
+        <w:rPr>
+          <w:color w:val="000000"/>
+        </w:rPr>
+        <w:t>-</w:t>
+      </w:r>
+      <w:r>
+        <w:rPr>
+          <w:color w:val="000000"/>
+        </w:rPr>
+        <w:t>4), but the distribution is extremely skewed: severity 2 accounts for ~80% of records while severity 4</w:t>
       </w:r>
       <w:r>
         <w:rPr>
@@ -380,7 +414,15 @@
       </w:pPr>
       <w:r>
         <w:lastRenderedPageBreak/>
-        <w:t>1.2 Model: CatBoost Binary Classifier</w:t>
+        <w:t xml:space="preserve">1.2 Model: </w:t>
+      </w:r>
+      <w:proofErr w:type="spellStart"/>
+      <w:r>
+        <w:t>CatBoost</w:t>
+      </w:r>
+      <w:proofErr w:type="spellEnd"/>
+      <w:r>
+        <w:t xml:space="preserve"> Binary Classifier</w:t>
       </w:r>
     </w:p>
     <w:p>
@@ -393,6 +435,7 @@
         </w:rPr>
         <w:t xml:space="preserve">We chose </w:t>
       </w:r>
+      <w:proofErr w:type="spellStart"/>
       <w:r>
         <w:rPr>
           <w:b/>
@@ -401,6 +444,7 @@
         </w:rPr>
         <w:t>CatBoost</w:t>
       </w:r>
+      <w:proofErr w:type="spellEnd"/>
       <w:r>
         <w:rPr>
           <w:color w:val="000000"/>
@@ -435,7 +479,21 @@
         <w:rPr>
           <w:color w:val="000000"/>
         </w:rPr>
-        <w:t xml:space="preserve"> no one-hot encoding needed, which would explode RAM on 7.7 M rows with high-cardinality features like Weather_Condition.</w:t>
+        <w:t xml:space="preserve"> no one-hot encoding needed, which would explode RAM on 7.7 M rows with high-cardinality features like </w:t>
+      </w:r>
+      <w:proofErr w:type="spellStart"/>
+      <w:r>
+        <w:rPr>
+          <w:color w:val="000000"/>
+        </w:rPr>
+        <w:t>Weather_Condition</w:t>
+      </w:r>
+      <w:proofErr w:type="spellEnd"/>
+      <w:r>
+        <w:rPr>
+          <w:color w:val="000000"/>
+        </w:rPr>
+        <w:t>.</w:t>
       </w:r>
     </w:p>
     <w:p>
@@ -465,7 +523,21 @@
         <w:rPr>
           <w:color w:val="000000"/>
         </w:rPr>
-        <w:t xml:space="preserve"> numeric NaN values are handled automatically; no imputation step is required.</w:t>
+        <w:t xml:space="preserve"> numeric </w:t>
+      </w:r>
+      <w:proofErr w:type="spellStart"/>
+      <w:r>
+        <w:rPr>
+          <w:color w:val="000000"/>
+        </w:rPr>
+        <w:t>NaN</w:t>
+      </w:r>
+      <w:proofErr w:type="spellEnd"/>
+      <w:r>
+        <w:rPr>
+          <w:color w:val="000000"/>
+        </w:rPr>
+        <w:t xml:space="preserve"> values are handled automatically; no imputation step is required.</w:t>
       </w:r>
     </w:p>
     <w:p>
@@ -495,7 +567,21 @@
         <w:rPr>
           <w:color w:val="000000"/>
         </w:rPr>
-        <w:t xml:space="preserve"> gradient boosting on 6.2 M training rows would be prohibitively slow on CPU in a Colab environment.</w:t>
+        <w:t xml:space="preserve"> gradient boosting on 6.2 M training rows would be prohibitively slow on CPU in a </w:t>
+      </w:r>
+      <w:proofErr w:type="spellStart"/>
+      <w:r>
+        <w:rPr>
+          <w:color w:val="000000"/>
+        </w:rPr>
+        <w:t>Colab</w:t>
+      </w:r>
+      <w:proofErr w:type="spellEnd"/>
+      <w:r>
+        <w:rPr>
+          <w:color w:val="000000"/>
+        </w:rPr>
+        <w:t xml:space="preserve"> environment.</w:t>
       </w:r>
     </w:p>
     <w:p>
@@ -537,12 +623,6 @@
         <w:gridCol w:w="4760"/>
       </w:tblGrid>
       <w:tr>
-        <w:tblPrEx>
-          <w:tblCellMar>
-            <w:top w:w="0" w:type="dxa"/>
-            <w:bottom w:w="0" w:type="dxa"/>
-          </w:tblCellMar>
-        </w:tblPrEx>
         <w:trPr>
           <w:tblHeader/>
         </w:trPr>
@@ -647,12 +727,6 @@
         </w:tc>
       </w:tr>
       <w:tr>
-        <w:tblPrEx>
-          <w:tblCellMar>
-            <w:top w:w="0" w:type="dxa"/>
-            <w:bottom w:w="0" w:type="dxa"/>
-          </w:tblCellMar>
-        </w:tblPrEx>
         <w:tc>
           <w:tcPr>
             <w:tcW w:w="2800" w:type="dxa"/>
@@ -745,12 +819,6 @@
         </w:tc>
       </w:tr>
       <w:tr>
-        <w:tblPrEx>
-          <w:tblCellMar>
-            <w:top w:w="0" w:type="dxa"/>
-            <w:bottom w:w="0" w:type="dxa"/>
-          </w:tblCellMar>
-        </w:tblPrEx>
         <w:tc>
           <w:tcPr>
             <w:tcW w:w="2800" w:type="dxa"/>
@@ -843,12 +911,6 @@
         </w:tc>
       </w:tr>
       <w:tr>
-        <w:tblPrEx>
-          <w:tblCellMar>
-            <w:top w:w="0" w:type="dxa"/>
-            <w:bottom w:w="0" w:type="dxa"/>
-          </w:tblCellMar>
-        </w:tblPrEx>
         <w:tc>
           <w:tcPr>
             <w:tcW w:w="2800" w:type="dxa"/>
@@ -867,6 +929,7 @@
             </w:tcMar>
           </w:tcPr>
           <w:p>
+            <w:proofErr w:type="spellStart"/>
             <w:r>
               <w:rPr>
                 <w:color w:val="000000"/>
@@ -875,6 +938,7 @@
               </w:rPr>
               <w:t>learning_rate</w:t>
             </w:r>
+            <w:proofErr w:type="spellEnd"/>
           </w:p>
         </w:tc>
         <w:tc>
@@ -941,12 +1005,6 @@
         </w:tc>
       </w:tr>
       <w:tr>
-        <w:tblPrEx>
-          <w:tblCellMar>
-            <w:top w:w="0" w:type="dxa"/>
-            <w:bottom w:w="0" w:type="dxa"/>
-          </w:tblCellMar>
-        </w:tblPrEx>
         <w:tc>
           <w:tcPr>
             <w:tcW w:w="2800" w:type="dxa"/>
@@ -965,6 +1023,7 @@
             </w:tcMar>
           </w:tcPr>
           <w:p>
+            <w:proofErr w:type="spellStart"/>
             <w:r>
               <w:rPr>
                 <w:color w:val="000000"/>
@@ -973,6 +1032,7 @@
               </w:rPr>
               <w:t>auto_class_weights</w:t>
             </w:r>
+            <w:proofErr w:type="spellEnd"/>
           </w:p>
         </w:tc>
         <w:tc>
@@ -1039,12 +1099,6 @@
         </w:tc>
       </w:tr>
       <w:tr>
-        <w:tblPrEx>
-          <w:tblCellMar>
-            <w:top w:w="0" w:type="dxa"/>
-            <w:bottom w:w="0" w:type="dxa"/>
-          </w:tblCellMar>
-        </w:tblPrEx>
         <w:tc>
           <w:tcPr>
             <w:tcW w:w="2800" w:type="dxa"/>
@@ -1063,6 +1117,7 @@
             </w:tcMar>
           </w:tcPr>
           <w:p>
+            <w:proofErr w:type="spellStart"/>
             <w:r>
               <w:rPr>
                 <w:color w:val="000000"/>
@@ -1071,6 +1126,7 @@
               </w:rPr>
               <w:t>loss_function</w:t>
             </w:r>
+            <w:proofErr w:type="spellEnd"/>
           </w:p>
         </w:tc>
         <w:tc>
@@ -1094,6 +1150,7 @@
             <w:pPr>
               <w:jc w:val="center"/>
             </w:pPr>
+            <w:proofErr w:type="spellStart"/>
             <w:r>
               <w:rPr>
                 <w:color w:val="000000"/>
@@ -1102,6 +1159,7 @@
               </w:rPr>
               <w:t>Logloss</w:t>
             </w:r>
+            <w:proofErr w:type="spellEnd"/>
           </w:p>
         </w:tc>
         <w:tc>
@@ -1137,12 +1195,6 @@
         </w:tc>
       </w:tr>
       <w:tr>
-        <w:tblPrEx>
-          <w:tblCellMar>
-            <w:top w:w="0" w:type="dxa"/>
-            <w:bottom w:w="0" w:type="dxa"/>
-          </w:tblCellMar>
-        </w:tblPrEx>
         <w:tc>
           <w:tcPr>
             <w:tcW w:w="2800" w:type="dxa"/>
@@ -1161,6 +1213,7 @@
             </w:tcMar>
           </w:tcPr>
           <w:p>
+            <w:proofErr w:type="spellStart"/>
             <w:r>
               <w:rPr>
                 <w:color w:val="000000"/>
@@ -1169,6 +1222,7 @@
               </w:rPr>
               <w:t>task_type</w:t>
             </w:r>
+            <w:proofErr w:type="spellEnd"/>
           </w:p>
         </w:tc>
         <w:tc>
@@ -1229,7 +1283,25 @@
                 <w:sz w:val="20"/>
                 <w:szCs w:val="20"/>
               </w:rPr>
-              <w:t>Required for 6 M row training in Colab time limits</w:t>
+              <w:t xml:space="preserve">Required for 6 M row training in </w:t>
+            </w:r>
+            <w:proofErr w:type="spellStart"/>
+            <w:r>
+              <w:rPr>
+                <w:color w:val="000000"/>
+                <w:sz w:val="20"/>
+                <w:szCs w:val="20"/>
+              </w:rPr>
+              <w:t>Colab</w:t>
+            </w:r>
+            <w:proofErr w:type="spellEnd"/>
+            <w:r>
+              <w:rPr>
+                <w:color w:val="000000"/>
+                <w:sz w:val="20"/>
+                <w:szCs w:val="20"/>
+              </w:rPr>
+              <w:t xml:space="preserve"> time limits</w:t>
             </w:r>
           </w:p>
         </w:tc>
@@ -1287,12 +1359,6 @@
         <w:gridCol w:w="3120"/>
       </w:tblGrid>
       <w:tr>
-        <w:tblPrEx>
-          <w:tblCellMar>
-            <w:top w:w="0" w:type="dxa"/>
-            <w:bottom w:w="0" w:type="dxa"/>
-          </w:tblCellMar>
-        </w:tblPrEx>
         <w:tc>
           <w:tcPr>
             <w:tcW w:w="3120" w:type="dxa"/>
@@ -1343,7 +1409,27 @@
                 <w:szCs w:val="18"/>
                 <w:lang w:val="nb-NO"/>
               </w:rPr>
-              <w:t>PR-AUC (full model)</w:t>
+              <w:t xml:space="preserve">PR-AUC (full </w:t>
+            </w:r>
+            <w:proofErr w:type="spellStart"/>
+            <w:r>
+              <w:rPr>
+                <w:color w:val="595959"/>
+                <w:sz w:val="18"/>
+                <w:szCs w:val="18"/>
+                <w:lang w:val="nb-NO"/>
+              </w:rPr>
+              <w:t>model</w:t>
+            </w:r>
+            <w:proofErr w:type="spellEnd"/>
+            <w:r>
+              <w:rPr>
+                <w:color w:val="595959"/>
+                <w:sz w:val="18"/>
+                <w:szCs w:val="18"/>
+                <w:lang w:val="nb-NO"/>
+              </w:rPr>
+              <w:t>)</w:t>
             </w:r>
           </w:p>
           <w:p>
@@ -1423,7 +1509,51 @@
                 <w:sz w:val="18"/>
                 <w:szCs w:val="18"/>
               </w:rPr>
-              <w:t>without lat/lng/state</w:t>
+              <w:t xml:space="preserve">without </w:t>
+            </w:r>
+            <w:proofErr w:type="spellStart"/>
+            <w:r>
+              <w:rPr>
+                <w:i/>
+                <w:iCs/>
+                <w:color w:val="595959"/>
+                <w:sz w:val="18"/>
+                <w:szCs w:val="18"/>
+              </w:rPr>
+              <w:t>lat</w:t>
+            </w:r>
+            <w:proofErr w:type="spellEnd"/>
+            <w:r>
+              <w:rPr>
+                <w:i/>
+                <w:iCs/>
+                <w:color w:val="595959"/>
+                <w:sz w:val="18"/>
+                <w:szCs w:val="18"/>
+              </w:rPr>
+              <w:t>/</w:t>
+            </w:r>
+            <w:proofErr w:type="spellStart"/>
+            <w:r>
+              <w:rPr>
+                <w:i/>
+                <w:iCs/>
+                <w:color w:val="595959"/>
+                <w:sz w:val="18"/>
+                <w:szCs w:val="18"/>
+              </w:rPr>
+              <w:t>lng</w:t>
+            </w:r>
+            <w:proofErr w:type="spellEnd"/>
+            <w:r>
+              <w:rPr>
+                <w:i/>
+                <w:iCs/>
+                <w:color w:val="595959"/>
+                <w:sz w:val="18"/>
+                <w:szCs w:val="18"/>
+              </w:rPr>
+              <w:t>/state</w:t>
             </w:r>
           </w:p>
         </w:tc>
@@ -1544,12 +1674,6 @@
         <w:gridCol w:w="1680"/>
       </w:tblGrid>
       <w:tr>
-        <w:tblPrEx>
-          <w:tblCellMar>
-            <w:top w:w="0" w:type="dxa"/>
-            <w:bottom w:w="0" w:type="dxa"/>
-          </w:tblCellMar>
-        </w:tblPrEx>
         <w:trPr>
           <w:tblHeader/>
         </w:trPr>
@@ -1720,12 +1844,6 @@
         </w:tc>
       </w:tr>
       <w:tr>
-        <w:tblPrEx>
-          <w:tblCellMar>
-            <w:top w:w="0" w:type="dxa"/>
-            <w:bottom w:w="0" w:type="dxa"/>
-          </w:tblCellMar>
-        </w:tblPrEx>
         <w:tc>
           <w:tcPr>
             <w:tcW w:w="2600" w:type="dxa"/>
@@ -1880,12 +1998,6 @@
         </w:tc>
       </w:tr>
       <w:tr>
-        <w:tblPrEx>
-          <w:tblCellMar>
-            <w:top w:w="0" w:type="dxa"/>
-            <w:bottom w:w="0" w:type="dxa"/>
-          </w:tblCellMar>
-        </w:tblPrEx>
         <w:tc>
           <w:tcPr>
             <w:tcW w:w="2600" w:type="dxa"/>
@@ -2066,12 +2178,6 @@
         <w:gridCol w:w="9360"/>
       </w:tblGrid>
       <w:tr>
-        <w:tblPrEx>
-          <w:tblCellMar>
-            <w:top w:w="0" w:type="dxa"/>
-            <w:bottom w:w="0" w:type="dxa"/>
-          </w:tblCellMar>
-        </w:tblPrEx>
         <w:tc>
           <w:tcPr>
             <w:tcW w:w="9360" w:type="dxa"/>
@@ -2132,18 +2238,40 @@
         <w:pStyle w:val="Heading2"/>
       </w:pPr>
       <w:r>
-        <w:t>2.1 Feature Importance — Full Model</w:t>
+        <w:t>2.1 Feature Importance Full Model</w:t>
       </w:r>
     </w:p>
     <w:p>
       <w:pPr>
         <w:spacing w:before="80" w:after="80"/>
       </w:pPr>
-      <w:r>
-        <w:rPr>
-          <w:color w:val="000000"/>
-        </w:rPr>
-        <w:t>CatBoost's PredictionValuesChange importance measures how much each feature shifts model output. In the full model, geographic features dominate:</w:t>
+      <w:proofErr w:type="spellStart"/>
+      <w:r>
+        <w:rPr>
+          <w:color w:val="000000"/>
+        </w:rPr>
+        <w:t>CatBoost's</w:t>
+      </w:r>
+      <w:proofErr w:type="spellEnd"/>
+      <w:r>
+        <w:rPr>
+          <w:color w:val="000000"/>
+        </w:rPr>
+        <w:t xml:space="preserve"> </w:t>
+      </w:r>
+      <w:proofErr w:type="spellStart"/>
+      <w:r>
+        <w:rPr>
+          <w:color w:val="000000"/>
+        </w:rPr>
+        <w:t>PredictionValuesChange</w:t>
+      </w:r>
+      <w:proofErr w:type="spellEnd"/>
+      <w:r>
+        <w:rPr>
+          <w:color w:val="000000"/>
+        </w:rPr>
+        <w:t xml:space="preserve"> importance measures how much each feature shifts model output. In the full model, geographic features dominate:</w:t>
       </w:r>
     </w:p>
     <w:p>
@@ -2175,12 +2303,6 @@
         <w:gridCol w:w="3015"/>
       </w:tblGrid>
       <w:tr>
-        <w:tblPrEx>
-          <w:tblCellMar>
-            <w:top w:w="0" w:type="dxa"/>
-            <w:bottom w:w="0" w:type="dxa"/>
-          </w:tblCellMar>
-        </w:tblPrEx>
         <w:trPr>
           <w:tblHeader/>
         </w:trPr>
@@ -2318,12 +2440,6 @@
         </w:tc>
       </w:tr>
       <w:tr>
-        <w:tblPrEx>
-          <w:tblCellMar>
-            <w:top w:w="0" w:type="dxa"/>
-            <w:bottom w:w="0" w:type="dxa"/>
-          </w:tblCellMar>
-        </w:tblPrEx>
         <w:tc>
           <w:tcPr>
             <w:tcW w:w="720" w:type="dxa"/>
@@ -2373,6 +2489,7 @@
             <w:pPr>
               <w:jc w:val="center"/>
             </w:pPr>
+            <w:proofErr w:type="spellStart"/>
             <w:r>
               <w:rPr>
                 <w:color w:val="000000"/>
@@ -2381,6 +2498,7 @@
               </w:rPr>
               <w:t>Start_Lng</w:t>
             </w:r>
+            <w:proofErr w:type="spellEnd"/>
           </w:p>
         </w:tc>
         <w:tc>
@@ -2447,12 +2565,6 @@
         </w:tc>
       </w:tr>
       <w:tr>
-        <w:tblPrEx>
-          <w:tblCellMar>
-            <w:top w:w="0" w:type="dxa"/>
-            <w:bottom w:w="0" w:type="dxa"/>
-          </w:tblCellMar>
-        </w:tblPrEx>
         <w:tc>
           <w:tcPr>
             <w:tcW w:w="720" w:type="dxa"/>
@@ -2502,6 +2614,7 @@
             <w:pPr>
               <w:jc w:val="center"/>
             </w:pPr>
+            <w:proofErr w:type="spellStart"/>
             <w:r>
               <w:rPr>
                 <w:color w:val="000000"/>
@@ -2510,6 +2623,7 @@
               </w:rPr>
               <w:t>Start_Lat</w:t>
             </w:r>
+            <w:proofErr w:type="spellEnd"/>
           </w:p>
         </w:tc>
         <w:tc>
@@ -2576,12 +2690,6 @@
         </w:tc>
       </w:tr>
       <w:tr>
-        <w:tblPrEx>
-          <w:tblCellMar>
-            <w:top w:w="0" w:type="dxa"/>
-            <w:bottom w:w="0" w:type="dxa"/>
-          </w:tblCellMar>
-        </w:tblPrEx>
         <w:tc>
           <w:tcPr>
             <w:tcW w:w="720" w:type="dxa"/>
@@ -2705,12 +2813,6 @@
         </w:tc>
       </w:tr>
       <w:tr>
-        <w:tblPrEx>
-          <w:tblCellMar>
-            <w:top w:w="0" w:type="dxa"/>
-            <w:bottom w:w="0" w:type="dxa"/>
-          </w:tblCellMar>
-        </w:tblPrEx>
         <w:tc>
           <w:tcPr>
             <w:tcW w:w="720" w:type="dxa"/>
@@ -2834,12 +2936,6 @@
         </w:tc>
       </w:tr>
       <w:tr>
-        <w:tblPrEx>
-          <w:tblCellMar>
-            <w:top w:w="0" w:type="dxa"/>
-            <w:bottom w:w="0" w:type="dxa"/>
-          </w:tblCellMar>
-        </w:tblPrEx>
         <w:tc>
           <w:tcPr>
             <w:tcW w:w="720" w:type="dxa"/>
@@ -2963,12 +3059,6 @@
         </w:tc>
       </w:tr>
       <w:tr>
-        <w:tblPrEx>
-          <w:tblCellMar>
-            <w:top w:w="0" w:type="dxa"/>
-            <w:bottom w:w="0" w:type="dxa"/>
-          </w:tblCellMar>
-        </w:tblPrEx>
         <w:tc>
           <w:tcPr>
             <w:tcW w:w="720" w:type="dxa"/>
@@ -3092,12 +3182,6 @@
         </w:tc>
       </w:tr>
       <w:tr>
-        <w:tblPrEx>
-          <w:tblCellMar>
-            <w:top w:w="0" w:type="dxa"/>
-            <w:bottom w:w="0" w:type="dxa"/>
-          </w:tblCellMar>
-        </w:tblPrEx>
         <w:tc>
           <w:tcPr>
             <w:tcW w:w="720" w:type="dxa"/>
@@ -3221,12 +3305,6 @@
         </w:tc>
       </w:tr>
       <w:tr>
-        <w:tblPrEx>
-          <w:tblCellMar>
-            <w:top w:w="0" w:type="dxa"/>
-            <w:bottom w:w="0" w:type="dxa"/>
-          </w:tblCellMar>
-        </w:tblPrEx>
         <w:tc>
           <w:tcPr>
             <w:tcW w:w="720" w:type="dxa"/>
@@ -3276,6 +3354,7 @@
             <w:pPr>
               <w:jc w:val="center"/>
             </w:pPr>
+            <w:proofErr w:type="spellStart"/>
             <w:r>
               <w:rPr>
                 <w:color w:val="000000"/>
@@ -3284,6 +3363,7 @@
               </w:rPr>
               <w:t>Traffic_Signal</w:t>
             </w:r>
+            <w:proofErr w:type="spellEnd"/>
           </w:p>
         </w:tc>
         <w:tc>
@@ -3350,12 +3430,6 @@
         </w:tc>
       </w:tr>
       <w:tr>
-        <w:tblPrEx>
-          <w:tblCellMar>
-            <w:top w:w="0" w:type="dxa"/>
-            <w:bottom w:w="0" w:type="dxa"/>
-          </w:tblCellMar>
-        </w:tblPrEx>
         <w:tc>
           <w:tcPr>
             <w:tcW w:w="720" w:type="dxa"/>
@@ -3479,12 +3553,6 @@
         </w:tc>
       </w:tr>
       <w:tr>
-        <w:tblPrEx>
-          <w:tblCellMar>
-            <w:top w:w="0" w:type="dxa"/>
-            <w:bottom w:w="0" w:type="dxa"/>
-          </w:tblCellMar>
-        </w:tblPrEx>
         <w:tc>
           <w:tcPr>
             <w:tcW w:w="720" w:type="dxa"/>
@@ -3534,6 +3602,7 @@
             <w:pPr>
               <w:jc w:val="center"/>
             </w:pPr>
+            <w:proofErr w:type="spellStart"/>
             <w:r>
               <w:rPr>
                 <w:color w:val="000000"/>
@@ -3542,6 +3611,7 @@
               </w:rPr>
               <w:t>Astronomical_Twilight</w:t>
             </w:r>
+            <w:proofErr w:type="spellEnd"/>
           </w:p>
         </w:tc>
         <w:tc>
@@ -3608,12 +3678,6 @@
         </w:tc>
       </w:tr>
       <w:tr>
-        <w:tblPrEx>
-          <w:tblCellMar>
-            <w:top w:w="0" w:type="dxa"/>
-            <w:bottom w:w="0" w:type="dxa"/>
-          </w:tblCellMar>
-        </w:tblPrEx>
         <w:tc>
           <w:tcPr>
             <w:tcW w:w="720" w:type="dxa"/>
@@ -3737,12 +3801,6 @@
         </w:tc>
       </w:tr>
       <w:tr>
-        <w:tblPrEx>
-          <w:tblCellMar>
-            <w:top w:w="0" w:type="dxa"/>
-            <w:bottom w:w="0" w:type="dxa"/>
-          </w:tblCellMar>
-        </w:tblPrEx>
         <w:tc>
           <w:tcPr>
             <w:tcW w:w="720" w:type="dxa"/>
@@ -3897,10 +3955,32 @@
     </w:p>
     <w:p>
       <w:pPr>
+        <w:spacing w:before="160"/>
+      </w:pPr>
+    </w:p>
+    <w:p>
+      <w:pPr>
+        <w:spacing w:before="160"/>
+      </w:pPr>
+    </w:p>
+    <w:p>
+      <w:pPr>
+        <w:spacing w:before="160"/>
+      </w:pPr>
+    </w:p>
+    <w:p>
+      <w:pPr>
         <w:pStyle w:val="Heading2"/>
       </w:pPr>
       <w:r>
-        <w:t>2.2 Feature Importance — Without Geography</w:t>
+        <w:lastRenderedPageBreak/>
+        <w:t>2.2 Feature Importance</w:t>
+      </w:r>
+      <w:r>
+        <w:t xml:space="preserve"> W</w:t>
+      </w:r>
+      <w:r>
+        <w:t>ithout Geography</w:t>
       </w:r>
     </w:p>
     <w:p>
@@ -3911,7 +3991,6 @@
         <w:rPr>
           <w:color w:val="000000"/>
         </w:rPr>
-        <w:lastRenderedPageBreak/>
         <w:t xml:space="preserve">Removing latitude, longitude, and state forces the model to rely on </w:t>
       </w:r>
       <w:r>
@@ -3920,13 +3999,41 @@
           <w:bCs/>
           <w:color w:val="000000"/>
         </w:rPr>
-        <w:t>actionable, generalisable features</w:t>
-      </w:r>
-      <w:r>
-        <w:rPr>
-          <w:color w:val="000000"/>
-        </w:rPr>
-        <w:t>. The PR-AUC drops from 0.218 to 0.122, confirming that geography contributes real predictive lift — but a meaningful signal remains without it.</w:t>
+        <w:t xml:space="preserve">actionable, </w:t>
+      </w:r>
+      <w:r>
+        <w:rPr>
+          <w:b/>
+          <w:bCs/>
+          <w:color w:val="000000"/>
+        </w:rPr>
+        <w:t>generalizable</w:t>
+      </w:r>
+      <w:r>
+        <w:rPr>
+          <w:b/>
+          <w:bCs/>
+          <w:color w:val="000000"/>
+        </w:rPr>
+        <w:t xml:space="preserve"> features</w:t>
+      </w:r>
+      <w:r>
+        <w:rPr>
+          <w:color w:val="000000"/>
+        </w:rPr>
+        <w:t>. The PR-AUC drops from 0.218 to 0.122, confirming that geography contributes real predictive lift</w:t>
+      </w:r>
+      <w:r>
+        <w:rPr>
+          <w:color w:val="000000"/>
+        </w:rPr>
+        <w:t>,</w:t>
+      </w:r>
+      <w:r>
+        <w:rPr>
+          <w:color w:val="000000"/>
+        </w:rPr>
+        <w:t xml:space="preserve"> but a meaningful signal remains without it.</w:t>
       </w:r>
     </w:p>
     <w:p>
@@ -3958,12 +4065,6 @@
         <w:gridCol w:w="4513"/>
       </w:tblGrid>
       <w:tr>
-        <w:tblPrEx>
-          <w:tblCellMar>
-            <w:top w:w="0" w:type="dxa"/>
-            <w:bottom w:w="0" w:type="dxa"/>
-          </w:tblCellMar>
-        </w:tblPrEx>
         <w:trPr>
           <w:tblHeader/>
         </w:trPr>
@@ -4101,12 +4202,6 @@
         </w:tc>
       </w:tr>
       <w:tr>
-        <w:tblPrEx>
-          <w:tblCellMar>
-            <w:top w:w="0" w:type="dxa"/>
-            <w:bottom w:w="0" w:type="dxa"/>
-          </w:tblCellMar>
-        </w:tblPrEx>
         <w:tc>
           <w:tcPr>
             <w:tcW w:w="720" w:type="dxa"/>
@@ -4156,6 +4251,7 @@
             <w:pPr>
               <w:jc w:val="center"/>
             </w:pPr>
+            <w:proofErr w:type="spellStart"/>
             <w:r>
               <w:rPr>
                 <w:color w:val="000000"/>
@@ -4164,6 +4260,7 @@
               </w:rPr>
               <w:t>Timezone</w:t>
             </w:r>
+            <w:proofErr w:type="spellEnd"/>
           </w:p>
         </w:tc>
         <w:tc>
@@ -4230,12 +4327,6 @@
         </w:tc>
       </w:tr>
       <w:tr>
-        <w:tblPrEx>
-          <w:tblCellMar>
-            <w:top w:w="0" w:type="dxa"/>
-            <w:bottom w:w="0" w:type="dxa"/>
-          </w:tblCellMar>
-        </w:tblPrEx>
         <w:tc>
           <w:tcPr>
             <w:tcW w:w="720" w:type="dxa"/>
@@ -4359,12 +4450,6 @@
         </w:tc>
       </w:tr>
       <w:tr>
-        <w:tblPrEx>
-          <w:tblCellMar>
-            <w:top w:w="0" w:type="dxa"/>
-            <w:bottom w:w="0" w:type="dxa"/>
-          </w:tblCellMar>
-        </w:tblPrEx>
         <w:tc>
           <w:tcPr>
             <w:tcW w:w="720" w:type="dxa"/>
@@ -4488,12 +4573,6 @@
         </w:tc>
       </w:tr>
       <w:tr>
-        <w:tblPrEx>
-          <w:tblCellMar>
-            <w:top w:w="0" w:type="dxa"/>
-            <w:bottom w:w="0" w:type="dxa"/>
-          </w:tblCellMar>
-        </w:tblPrEx>
         <w:tc>
           <w:tcPr>
             <w:tcW w:w="720" w:type="dxa"/>
@@ -4617,12 +4696,6 @@
         </w:tc>
       </w:tr>
       <w:tr>
-        <w:tblPrEx>
-          <w:tblCellMar>
-            <w:top w:w="0" w:type="dxa"/>
-            <w:bottom w:w="0" w:type="dxa"/>
-          </w:tblCellMar>
-        </w:tblPrEx>
         <w:tc>
           <w:tcPr>
             <w:tcW w:w="720" w:type="dxa"/>
@@ -4746,12 +4819,6 @@
         </w:tc>
       </w:tr>
       <w:tr>
-        <w:tblPrEx>
-          <w:tblCellMar>
-            <w:top w:w="0" w:type="dxa"/>
-            <w:bottom w:w="0" w:type="dxa"/>
-          </w:tblCellMar>
-        </w:tblPrEx>
         <w:tc>
           <w:tcPr>
             <w:tcW w:w="720" w:type="dxa"/>
@@ -4875,12 +4942,6 @@
         </w:tc>
       </w:tr>
       <w:tr>
-        <w:tblPrEx>
-          <w:tblCellMar>
-            <w:top w:w="0" w:type="dxa"/>
-            <w:bottom w:w="0" w:type="dxa"/>
-          </w:tblCellMar>
-        </w:tblPrEx>
         <w:tc>
           <w:tcPr>
             <w:tcW w:w="720" w:type="dxa"/>
@@ -4930,6 +4991,7 @@
             <w:pPr>
               <w:jc w:val="center"/>
             </w:pPr>
+            <w:proofErr w:type="spellStart"/>
             <w:r>
               <w:rPr>
                 <w:color w:val="000000"/>
@@ -4938,6 +5000,7 @@
               </w:rPr>
               <w:t>Traffic_Signal</w:t>
             </w:r>
+            <w:proofErr w:type="spellEnd"/>
           </w:p>
         </w:tc>
         <w:tc>
@@ -5004,12 +5067,6 @@
         </w:tc>
       </w:tr>
       <w:tr>
-        <w:tblPrEx>
-          <w:tblCellMar>
-            <w:top w:w="0" w:type="dxa"/>
-            <w:bottom w:w="0" w:type="dxa"/>
-          </w:tblCellMar>
-        </w:tblPrEx>
         <w:tc>
           <w:tcPr>
             <w:tcW w:w="720" w:type="dxa"/>
@@ -5133,12 +5190,6 @@
         </w:tc>
       </w:tr>
       <w:tr>
-        <w:tblPrEx>
-          <w:tblCellMar>
-            <w:top w:w="0" w:type="dxa"/>
-            <w:bottom w:w="0" w:type="dxa"/>
-          </w:tblCellMar>
-        </w:tblPrEx>
         <w:tc>
           <w:tcPr>
             <w:tcW w:w="720" w:type="dxa"/>
@@ -5305,7 +5356,19 @@
         <w:rPr>
           <w:color w:val="000000"/>
         </w:rPr>
-        <w:t xml:space="preserve"> are more likely to escalate to severity 4 — likely due to higher speeds, fatigue, and reduced visibility. Month captures seasonal effects: winter months bring ice and reduced traction. Year has high importance because the dataset spans 2016–2023 and </w:t>
+        <w:t xml:space="preserve"> are more likely to escalate to severity 4 </w:t>
+      </w:r>
+      <w:r>
+        <w:rPr>
+          <w:color w:val="000000"/>
+        </w:rPr>
+        <w:t>which is</w:t>
+      </w:r>
+      <w:r>
+        <w:rPr>
+          <w:color w:val="000000"/>
+        </w:rPr>
+        <w:t xml:space="preserve"> likely due to higher speeds, fatigue, and reduced visibility. Month captures seasonal effects: winter months bring ice and reduced traction. Year has high importance because the dataset spans 2016–2023 and </w:t>
       </w:r>
       <w:r>
         <w:rPr>
@@ -5332,7 +5395,15 @@
         <w:pStyle w:val="Heading3"/>
       </w:pPr>
       <w:r>
-        <w:t>Infrastructure (Crossing, Traffic_Signal, Junction)</w:t>
+        <w:t xml:space="preserve">Infrastructure (Crossing, </w:t>
+      </w:r>
+      <w:proofErr w:type="spellStart"/>
+      <w:r>
+        <w:t>Traffic_Signal</w:t>
+      </w:r>
+      <w:proofErr w:type="spellEnd"/>
+      <w:r>
+        <w:t>, Junction)</w:t>
       </w:r>
     </w:p>
     <w:p>
@@ -5357,7 +5428,19 @@
         <w:rPr>
           <w:color w:val="000000"/>
         </w:rPr>
-        <w:t xml:space="preserve"> are disproportionately severe. These are high-conflict points where perpendicular traffic meets — side-impact collisions at intersections are well-documented as more dangerous than rear-end collisions. Presence of a junction similarly indicates complex traffic geometry.</w:t>
+        <w:t xml:space="preserve"> are disproportionately severe. These are high-conflict points where perpendicular traffic meets</w:t>
+      </w:r>
+      <w:r>
+        <w:rPr>
+          <w:color w:val="000000"/>
+        </w:rPr>
+        <w:t>,</w:t>
+      </w:r>
+      <w:r>
+        <w:rPr>
+          <w:color w:val="000000"/>
+        </w:rPr>
+        <w:t xml:space="preserve"> side-impact collisions at intersections are well-documented as more dangerous than rear-end collisions. Presence of a junction similarly indicates complex traffic geometry.</w:t>
       </w:r>
     </w:p>
     <w:p>
@@ -5409,7 +5492,21 @@
         <w:rPr>
           <w:color w:val="000000"/>
         </w:rPr>
-        <w:t xml:space="preserve"> directly increases stopping distances and reduces tyre grip. </w:t>
+        <w:t xml:space="preserve"> directly increases stopping distances and reduces </w:t>
+      </w:r>
+      <w:proofErr w:type="spellStart"/>
+      <w:r>
+        <w:rPr>
+          <w:color w:val="000000"/>
+        </w:rPr>
+        <w:t>tyre</w:t>
+      </w:r>
+      <w:proofErr w:type="spellEnd"/>
+      <w:r>
+        <w:rPr>
+          <w:color w:val="000000"/>
+        </w:rPr>
+        <w:t xml:space="preserve"> grip. </w:t>
       </w:r>
       <w:r>
         <w:rPr>
@@ -5423,7 +5520,21 @@
         <w:rPr>
           <w:color w:val="000000"/>
         </w:rPr>
-        <w:t xml:space="preserve"> affect both road surfaces (black ice, tyre blow-outs) and driver alertness.</w:t>
+        <w:t xml:space="preserve"> affect both road surfaces (black ice, </w:t>
+      </w:r>
+      <w:proofErr w:type="spellStart"/>
+      <w:r>
+        <w:rPr>
+          <w:color w:val="000000"/>
+        </w:rPr>
+        <w:t>tyre</w:t>
+      </w:r>
+      <w:proofErr w:type="spellEnd"/>
+      <w:r>
+        <w:rPr>
+          <w:color w:val="000000"/>
+        </w:rPr>
+        <w:t xml:space="preserve"> blow-outs) and driver alertness.</w:t>
       </w:r>
     </w:p>
     <w:p>
@@ -5447,6 +5558,7 @@
         <w:rPr>
           <w:color w:val="000000"/>
         </w:rPr>
+        <w:lastRenderedPageBreak/>
         <w:t xml:space="preserve">The twilight variables capture ambient light levels more precisely than a simple Day/Night flag. </w:t>
       </w:r>
       <w:r>
@@ -5485,14 +5597,7 @@
         <w:rPr>
           <w:color w:val="000000"/>
         </w:rPr>
-        <w:t xml:space="preserve"> marks the transition </w:t>
-      </w:r>
-      <w:r>
-        <w:rPr>
-          <w:color w:val="000000"/>
-        </w:rPr>
-        <w:lastRenderedPageBreak/>
-        <w:t>where headlights are necessary but surroundings remain partially visible, creating visual confusion that correlates with higher-severity outcomes.</w:t>
+        <w:t xml:space="preserve"> marks the transition where headlights are necessary but surroundings remain partially visible, creating visual confusion that correlates with higher-severity outcomes.</w:t>
       </w:r>
     </w:p>
     <w:p>
@@ -5540,7 +5645,33 @@
         <w:rPr>
           <w:color w:val="000000"/>
         </w:rPr>
-        <w:t>The raw dataset has 7.7 M rows and 47 columns. Loading it entirely in a standard pandas DataFrame would require ~8–10 GB of RAM</w:t>
+        <w:t xml:space="preserve">The raw dataset has 7.7 M rows and 47 columns. Loading it entirely in a standard pandas </w:t>
+      </w:r>
+      <w:proofErr w:type="spellStart"/>
+      <w:r>
+        <w:rPr>
+          <w:color w:val="000000"/>
+        </w:rPr>
+        <w:t>DataFrame</w:t>
+      </w:r>
+      <w:proofErr w:type="spellEnd"/>
+      <w:r>
+        <w:rPr>
+          <w:color w:val="000000"/>
+        </w:rPr>
+        <w:t xml:space="preserve"> would require ~8</w:t>
+      </w:r>
+      <w:r>
+        <w:rPr>
+          <w:color w:val="000000"/>
+        </w:rPr>
+        <w:t xml:space="preserve"> to </w:t>
+      </w:r>
+      <w:r>
+        <w:rPr>
+          <w:color w:val="000000"/>
+        </w:rPr>
+        <w:t>10 GB of RAM</w:t>
       </w:r>
       <w:r>
         <w:rPr>
@@ -5552,7 +5683,21 @@
         <w:rPr>
           <w:color w:val="000000"/>
         </w:rPr>
-        <w:t>exceeding Colab’s 12 GB limit when combined with model training overhead. We addressed this by:</w:t>
+        <w:t xml:space="preserve">exceeding </w:t>
+      </w:r>
+      <w:proofErr w:type="spellStart"/>
+      <w:r>
+        <w:rPr>
+          <w:color w:val="000000"/>
+        </w:rPr>
+        <w:t>Colab’s</w:t>
+      </w:r>
+      <w:proofErr w:type="spellEnd"/>
+      <w:r>
+        <w:rPr>
+          <w:color w:val="000000"/>
+        </w:rPr>
+        <w:t xml:space="preserve"> 12 GB limit when combined with model training overhead. We addressed this by:</w:t>
       </w:r>
     </w:p>
     <w:p>
@@ -5594,14 +5739,34 @@
         </w:numPr>
         <w:spacing w:before="60" w:after="60"/>
       </w:pPr>
+      <w:proofErr w:type="spellStart"/>
       <w:r>
         <w:rPr>
           <w:b/>
           <w:bCs/>
           <w:color w:val="000000"/>
         </w:rPr>
-        <w:t>dtype downcasting</w:t>
-      </w:r>
+        <w:t>dtype</w:t>
+      </w:r>
+      <w:proofErr w:type="spellEnd"/>
+      <w:r>
+        <w:rPr>
+          <w:b/>
+          <w:bCs/>
+          <w:color w:val="000000"/>
+        </w:rPr>
+        <w:t xml:space="preserve"> </w:t>
+      </w:r>
+      <w:proofErr w:type="spellStart"/>
+      <w:r>
+        <w:rPr>
+          <w:b/>
+          <w:bCs/>
+          <w:color w:val="000000"/>
+        </w:rPr>
+        <w:t>downcasting</w:t>
+      </w:r>
+      <w:proofErr w:type="spellEnd"/>
       <w:r>
         <w:rPr>
           <w:color w:val="000000"/>
@@ -5612,7 +5777,49 @@
         <w:rPr>
           <w:color w:val="000000"/>
         </w:rPr>
-        <w:t xml:space="preserve"> float64 → float32 for numeric features (halves memory), string categoricals → pandas category dtype, booleans → int8. Final footprint: ~0.94 GB.</w:t>
+        <w:t xml:space="preserve"> float64 → float32 for numeric features (halves memory), string </w:t>
+      </w:r>
+      <w:proofErr w:type="spellStart"/>
+      <w:r>
+        <w:rPr>
+          <w:color w:val="000000"/>
+        </w:rPr>
+        <w:t>categoricals</w:t>
+      </w:r>
+      <w:proofErr w:type="spellEnd"/>
+      <w:r>
+        <w:rPr>
+          <w:color w:val="000000"/>
+        </w:rPr>
+        <w:t xml:space="preserve"> → pandas category </w:t>
+      </w:r>
+      <w:proofErr w:type="spellStart"/>
+      <w:r>
+        <w:rPr>
+          <w:color w:val="000000"/>
+        </w:rPr>
+        <w:t>dtype</w:t>
+      </w:r>
+      <w:proofErr w:type="spellEnd"/>
+      <w:r>
+        <w:rPr>
+          <w:color w:val="000000"/>
+        </w:rPr>
+        <w:t xml:space="preserve">, </w:t>
+      </w:r>
+      <w:proofErr w:type="spellStart"/>
+      <w:r>
+        <w:rPr>
+          <w:color w:val="000000"/>
+        </w:rPr>
+        <w:t>booleans</w:t>
+      </w:r>
+      <w:proofErr w:type="spellEnd"/>
+      <w:r>
+        <w:rPr>
+          <w:color w:val="000000"/>
+        </w:rPr>
+        <w:t xml:space="preserve"> → int8. Final footprint: ~0.94 GB.</w:t>
       </w:r>
     </w:p>
     <w:p>
@@ -5632,11 +5839,61 @@
       <w:pPr>
         <w:spacing w:before="80" w:after="80"/>
       </w:pPr>
-      <w:r>
-        <w:rPr>
-          <w:color w:val="000000"/>
-        </w:rPr>
-        <w:t xml:space="preserve">Start_Time was parsed and decomposed into five compact features: hour, dayofweek, month, year, and is_weekend. All derived columns were NaN-filled with </w:t>
+      <w:proofErr w:type="spellStart"/>
+      <w:r>
+        <w:rPr>
+          <w:color w:val="000000"/>
+        </w:rPr>
+        <w:t>Start_Time</w:t>
+      </w:r>
+      <w:proofErr w:type="spellEnd"/>
+      <w:r>
+        <w:rPr>
+          <w:color w:val="000000"/>
+        </w:rPr>
+        <w:t xml:space="preserve"> was parsed and decomposed into five compact features: hour, </w:t>
+      </w:r>
+      <w:proofErr w:type="spellStart"/>
+      <w:r>
+        <w:rPr>
+          <w:color w:val="000000"/>
+        </w:rPr>
+        <w:t>dayofweek</w:t>
+      </w:r>
+      <w:proofErr w:type="spellEnd"/>
+      <w:r>
+        <w:rPr>
+          <w:color w:val="000000"/>
+        </w:rPr>
+        <w:t xml:space="preserve">, month, year, and </w:t>
+      </w:r>
+      <w:proofErr w:type="spellStart"/>
+      <w:r>
+        <w:rPr>
+          <w:color w:val="000000"/>
+        </w:rPr>
+        <w:t>is_weekend</w:t>
+      </w:r>
+      <w:proofErr w:type="spellEnd"/>
+      <w:r>
+        <w:rPr>
+          <w:color w:val="000000"/>
+        </w:rPr>
+        <w:t xml:space="preserve">. All derived columns were </w:t>
+      </w:r>
+      <w:proofErr w:type="spellStart"/>
+      <w:r>
+        <w:rPr>
+          <w:color w:val="000000"/>
+        </w:rPr>
+        <w:t>NaN</w:t>
+      </w:r>
+      <w:proofErr w:type="spellEnd"/>
+      <w:r>
+        <w:rPr>
+          <w:color w:val="000000"/>
+        </w:rPr>
+        <w:t xml:space="preserve">-filled with </w:t>
       </w:r>
       <w:r>
         <w:rPr>
@@ -5648,7 +5905,21 @@
         <w:rPr>
           <w:color w:val="000000"/>
         </w:rPr>
-        <w:t>1 (sentinel for missing) and cast to int8/int16 before Start_Time was dropped to free memory.</w:t>
+        <w:t xml:space="preserve">1 (sentinel for missing) and cast to int8/int16 before </w:t>
+      </w:r>
+      <w:proofErr w:type="spellStart"/>
+      <w:r>
+        <w:rPr>
+          <w:color w:val="000000"/>
+        </w:rPr>
+        <w:t>Start_Time</w:t>
+      </w:r>
+      <w:proofErr w:type="spellEnd"/>
+      <w:r>
+        <w:rPr>
+          <w:color w:val="000000"/>
+        </w:rPr>
+        <w:t xml:space="preserve"> was dropped to free memory.</w:t>
       </w:r>
     </w:p>
     <w:p>
@@ -5661,18 +5932,62 @@
         <w:pStyle w:val="Heading3"/>
       </w:pPr>
       <w:r>
-        <w:t>Categorical NaN handling</w:t>
+        <w:t xml:space="preserve">Categorical </w:t>
+      </w:r>
+      <w:proofErr w:type="spellStart"/>
+      <w:r>
+        <w:t>NaN</w:t>
+      </w:r>
+      <w:proofErr w:type="spellEnd"/>
+      <w:r>
+        <w:t xml:space="preserve"> handling</w:t>
       </w:r>
     </w:p>
     <w:p>
       <w:pPr>
         <w:spacing w:before="80" w:after="80"/>
       </w:pPr>
-      <w:r>
-        <w:rPr>
-          <w:color w:val="000000"/>
-        </w:rPr>
-        <w:t>CatBoost requires no NaN in categorical columns. We added an ‘Unknown’ category to each pandas Categorical series and filled nulls before fitting, without converting to string (which would lose the memory benefit of category dtype).</w:t>
+      <w:proofErr w:type="spellStart"/>
+      <w:r>
+        <w:rPr>
+          <w:color w:val="000000"/>
+        </w:rPr>
+        <w:t>CatBoost</w:t>
+      </w:r>
+      <w:proofErr w:type="spellEnd"/>
+      <w:r>
+        <w:rPr>
+          <w:color w:val="000000"/>
+        </w:rPr>
+        <w:t xml:space="preserve"> requires no </w:t>
+      </w:r>
+      <w:proofErr w:type="spellStart"/>
+      <w:r>
+        <w:rPr>
+          <w:color w:val="000000"/>
+        </w:rPr>
+        <w:t>NaN</w:t>
+      </w:r>
+      <w:proofErr w:type="spellEnd"/>
+      <w:r>
+        <w:rPr>
+          <w:color w:val="000000"/>
+        </w:rPr>
+        <w:t xml:space="preserve"> in categorical columns. We added an ‘Unknown’ category to each pandas Categorical series and filled nulls before fitting, without converting to string (which would lose the memory benefit of category </w:t>
+      </w:r>
+      <w:proofErr w:type="spellStart"/>
+      <w:r>
+        <w:rPr>
+          <w:color w:val="000000"/>
+        </w:rPr>
+        <w:t>dtype</w:t>
+      </w:r>
+      <w:proofErr w:type="spellEnd"/>
+      <w:r>
+        <w:rPr>
+          <w:color w:val="000000"/>
+        </w:rPr>
+        <w:t>).</w:t>
       </w:r>
     </w:p>
     <w:p>
@@ -5744,7 +6059,22 @@
         <w:rPr>
           <w:color w:val="000000"/>
         </w:rPr>
-        <w:t>We retrained the model with latitude, longitude, and state removed to quantify their contribution and surface the more generalisable non-geographic factors for interpretability.</w:t>
+        <w:lastRenderedPageBreak/>
+        <w:t xml:space="preserve">We retrained the model with latitude, longitude, and state removed to quantify their contribution and surface the more </w:t>
+      </w:r>
+      <w:proofErr w:type="spellStart"/>
+      <w:r>
+        <w:rPr>
+          <w:color w:val="000000"/>
+        </w:rPr>
+        <w:t>generalisable</w:t>
+      </w:r>
+      <w:proofErr w:type="spellEnd"/>
+      <w:r>
+        <w:rPr>
+          <w:color w:val="000000"/>
+        </w:rPr>
+        <w:t xml:space="preserve"> non-geographic factors for interpretability.</w:t>
       </w:r>
     </w:p>
     <w:p>
@@ -5788,12 +6118,6 @@
         <w:gridCol w:w="4360"/>
       </w:tblGrid>
       <w:tr>
-        <w:tblPrEx>
-          <w:tblCellMar>
-            <w:top w:w="0" w:type="dxa"/>
-            <w:bottom w:w="0" w:type="dxa"/>
-          </w:tblCellMar>
-        </w:tblPrEx>
         <w:trPr>
           <w:tblHeader/>
         </w:trPr>
@@ -5898,12 +6222,6 @@
         </w:tc>
       </w:tr>
       <w:tr>
-        <w:tblPrEx>
-          <w:tblCellMar>
-            <w:top w:w="0" w:type="dxa"/>
-            <w:bottom w:w="0" w:type="dxa"/>
-          </w:tblCellMar>
-        </w:tblPrEx>
         <w:tc>
           <w:tcPr>
             <w:tcW w:w="2500" w:type="dxa"/>
@@ -5928,8 +6246,18 @@
                 <w:sz w:val="20"/>
                 <w:szCs w:val="20"/>
               </w:rPr>
-              <w:t>12 GB RAM ceiling on Colab</w:t>
-            </w:r>
+              <w:t xml:space="preserve">12 GB RAM ceiling on </w:t>
+            </w:r>
+            <w:proofErr w:type="spellStart"/>
+            <w:r>
+              <w:rPr>
+                <w:color w:val="000000"/>
+                <w:sz w:val="20"/>
+                <w:szCs w:val="20"/>
+              </w:rPr>
+              <w:t>Colab</w:t>
+            </w:r>
+            <w:proofErr w:type="spellEnd"/>
           </w:p>
         </w:tc>
         <w:tc>
@@ -5990,18 +6318,30 @@
                 <w:sz w:val="20"/>
                 <w:szCs w:val="20"/>
               </w:rPr>
-              <w:t>Load only 22 columns; downcast all dtypes immediately on load</w:t>
+              <w:t xml:space="preserve">Load only 22 columns; downcast all </w:t>
+            </w:r>
+            <w:proofErr w:type="spellStart"/>
+            <w:r>
+              <w:rPr>
+                <w:color w:val="000000"/>
+                <w:sz w:val="20"/>
+                <w:szCs w:val="20"/>
+              </w:rPr>
+              <w:t>dtypes</w:t>
+            </w:r>
+            <w:proofErr w:type="spellEnd"/>
+            <w:r>
+              <w:rPr>
+                <w:color w:val="000000"/>
+                <w:sz w:val="20"/>
+                <w:szCs w:val="20"/>
+              </w:rPr>
+              <w:t xml:space="preserve"> immediately on load</w:t>
             </w:r>
           </w:p>
         </w:tc>
       </w:tr>
       <w:tr>
-        <w:tblPrEx>
-          <w:tblCellMar>
-            <w:top w:w="0" w:type="dxa"/>
-            <w:bottom w:w="0" w:type="dxa"/>
-          </w:tblCellMar>
-        </w:tblPrEx>
         <w:tc>
           <w:tcPr>
             <w:tcW w:w="2500" w:type="dxa"/>
@@ -6026,7 +6366,43 @@
                 <w:sz w:val="20"/>
                 <w:szCs w:val="20"/>
               </w:rPr>
-              <w:t>~9.6% of Start_Time values are null (NaT)</w:t>
+              <w:t xml:space="preserve">~9.6% of </w:t>
+            </w:r>
+            <w:proofErr w:type="spellStart"/>
+            <w:r>
+              <w:rPr>
+                <w:color w:val="000000"/>
+                <w:sz w:val="20"/>
+                <w:szCs w:val="20"/>
+              </w:rPr>
+              <w:t>Start_Time</w:t>
+            </w:r>
+            <w:proofErr w:type="spellEnd"/>
+            <w:r>
+              <w:rPr>
+                <w:color w:val="000000"/>
+                <w:sz w:val="20"/>
+                <w:szCs w:val="20"/>
+              </w:rPr>
+              <w:t xml:space="preserve"> values are null (</w:t>
+            </w:r>
+            <w:proofErr w:type="spellStart"/>
+            <w:r>
+              <w:rPr>
+                <w:color w:val="000000"/>
+                <w:sz w:val="20"/>
+                <w:szCs w:val="20"/>
+              </w:rPr>
+              <w:t>NaT</w:t>
+            </w:r>
+            <w:proofErr w:type="spellEnd"/>
+            <w:r>
+              <w:rPr>
+                <w:color w:val="000000"/>
+                <w:sz w:val="20"/>
+                <w:szCs w:val="20"/>
+              </w:rPr>
+              <w:t>)</w:t>
             </w:r>
           </w:p>
         </w:tc>
@@ -6057,7 +6433,25 @@
                 <w:sz w:val="20"/>
                 <w:szCs w:val="20"/>
               </w:rPr>
-              <w:t>Silent NaN propagation into time features</w:t>
+              <w:t xml:space="preserve">Silent </w:t>
+            </w:r>
+            <w:proofErr w:type="spellStart"/>
+            <w:r>
+              <w:rPr>
+                <w:color w:val="000000"/>
+                <w:sz w:val="20"/>
+                <w:szCs w:val="20"/>
+              </w:rPr>
+              <w:t>NaN</w:t>
+            </w:r>
+            <w:proofErr w:type="spellEnd"/>
+            <w:r>
+              <w:rPr>
+                <w:color w:val="000000"/>
+                <w:sz w:val="20"/>
+                <w:szCs w:val="20"/>
+              </w:rPr>
+              <w:t xml:space="preserve"> propagation into time features</w:t>
             </w:r>
           </w:p>
         </w:tc>
@@ -6088,18 +6482,30 @@
                 <w:sz w:val="20"/>
                 <w:szCs w:val="20"/>
               </w:rPr>
-              <w:t>Explicit fillna(-1) with int cast on all derived time columns</w:t>
+              <w:t xml:space="preserve">Explicit </w:t>
+            </w:r>
+            <w:proofErr w:type="spellStart"/>
+            <w:r>
+              <w:rPr>
+                <w:color w:val="000000"/>
+                <w:sz w:val="20"/>
+                <w:szCs w:val="20"/>
+              </w:rPr>
+              <w:t>fillna</w:t>
+            </w:r>
+            <w:proofErr w:type="spellEnd"/>
+            <w:r>
+              <w:rPr>
+                <w:color w:val="000000"/>
+                <w:sz w:val="20"/>
+                <w:szCs w:val="20"/>
+              </w:rPr>
+              <w:t>(-1) with int cast on all derived time columns</w:t>
             </w:r>
           </w:p>
         </w:tc>
       </w:tr>
       <w:tr>
-        <w:tblPrEx>
-          <w:tblCellMar>
-            <w:top w:w="0" w:type="dxa"/>
-            <w:bottom w:w="0" w:type="dxa"/>
-          </w:tblCellMar>
-        </w:tblPrEx>
         <w:tc>
           <w:tcPr>
             <w:tcW w:w="2500" w:type="dxa"/>
@@ -6180,24 +6586,46 @@
             <w:pPr>
               <w:jc w:val="center"/>
             </w:pPr>
-            <w:r>
-              <w:rPr>
-                <w:color w:val="000000"/>
-                <w:sz w:val="20"/>
-                <w:szCs w:val="20"/>
-              </w:rPr>
-              <w:t>auto_class_weights='Balanced' in CatBoost + threshold sweep</w:t>
+            <w:proofErr w:type="spellStart"/>
+            <w:r>
+              <w:rPr>
+                <w:color w:val="000000"/>
+                <w:sz w:val="20"/>
+                <w:szCs w:val="20"/>
+              </w:rPr>
+              <w:t>auto_class_weights</w:t>
+            </w:r>
+            <w:proofErr w:type="spellEnd"/>
+            <w:r>
+              <w:rPr>
+                <w:color w:val="000000"/>
+                <w:sz w:val="20"/>
+                <w:szCs w:val="20"/>
+              </w:rPr>
+              <w:t xml:space="preserve">='Balanced' in </w:t>
+            </w:r>
+            <w:proofErr w:type="spellStart"/>
+            <w:r>
+              <w:rPr>
+                <w:color w:val="000000"/>
+                <w:sz w:val="20"/>
+                <w:szCs w:val="20"/>
+              </w:rPr>
+              <w:t>CatBoost</w:t>
+            </w:r>
+            <w:proofErr w:type="spellEnd"/>
+            <w:r>
+              <w:rPr>
+                <w:color w:val="000000"/>
+                <w:sz w:val="20"/>
+                <w:szCs w:val="20"/>
+              </w:rPr>
+              <w:t xml:space="preserve"> + threshold sweep</w:t>
             </w:r>
           </w:p>
         </w:tc>
       </w:tr>
       <w:tr>
-        <w:tblPrEx>
-          <w:tblCellMar>
-            <w:top w:w="0" w:type="dxa"/>
-            <w:bottom w:w="0" w:type="dxa"/>
-          </w:tblCellMar>
-        </w:tblPrEx>
         <w:tc>
           <w:tcPr>
             <w:tcW w:w="2500" w:type="dxa"/>
@@ -6278,24 +6706,46 @@
             <w:pPr>
               <w:jc w:val="center"/>
             </w:pPr>
-            <w:r>
-              <w:rPr>
-                <w:color w:val="000000"/>
-                <w:sz w:val="20"/>
-                <w:szCs w:val="20"/>
-              </w:rPr>
-              <w:t>CatBoost handles numeric NaN natively; no imputation needed</w:t>
+            <w:proofErr w:type="spellStart"/>
+            <w:r>
+              <w:rPr>
+                <w:color w:val="000000"/>
+                <w:sz w:val="20"/>
+                <w:szCs w:val="20"/>
+              </w:rPr>
+              <w:t>CatBoost</w:t>
+            </w:r>
+            <w:proofErr w:type="spellEnd"/>
+            <w:r>
+              <w:rPr>
+                <w:color w:val="000000"/>
+                <w:sz w:val="20"/>
+                <w:szCs w:val="20"/>
+              </w:rPr>
+              <w:t xml:space="preserve"> handles numeric </w:t>
+            </w:r>
+            <w:proofErr w:type="spellStart"/>
+            <w:r>
+              <w:rPr>
+                <w:color w:val="000000"/>
+                <w:sz w:val="20"/>
+                <w:szCs w:val="20"/>
+              </w:rPr>
+              <w:t>NaN</w:t>
+            </w:r>
+            <w:proofErr w:type="spellEnd"/>
+            <w:r>
+              <w:rPr>
+                <w:color w:val="000000"/>
+                <w:sz w:val="20"/>
+                <w:szCs w:val="20"/>
+              </w:rPr>
+              <w:t xml:space="preserve"> natively; no imputation needed</w:t>
             </w:r>
           </w:p>
         </w:tc>
       </w:tr>
       <w:tr>
-        <w:tblPrEx>
-          <w:tblCellMar>
-            <w:top w:w="0" w:type="dxa"/>
-            <w:bottom w:w="0" w:type="dxa"/>
-          </w:tblCellMar>
-        </w:tblPrEx>
         <w:tc>
           <w:tcPr>
             <w:tcW w:w="2500" w:type="dxa"/>
@@ -6388,12 +6838,6 @@
         </w:tc>
       </w:tr>
       <w:tr>
-        <w:tblPrEx>
-          <w:tblCellMar>
-            <w:top w:w="0" w:type="dxa"/>
-            <w:bottom w:w="0" w:type="dxa"/>
-          </w:tblCellMar>
-        </w:tblPrEx>
         <w:tc>
           <w:tcPr>
             <w:tcW w:w="2500" w:type="dxa"/>
@@ -6418,7 +6862,43 @@
                 <w:sz w:val="20"/>
                 <w:szCs w:val="20"/>
               </w:rPr>
-              <w:t>High-cardinality categoricals (Weather_Condition has 100+ values)</w:t>
+              <w:t xml:space="preserve">High-cardinality </w:t>
+            </w:r>
+            <w:proofErr w:type="spellStart"/>
+            <w:r>
+              <w:rPr>
+                <w:color w:val="000000"/>
+                <w:sz w:val="20"/>
+                <w:szCs w:val="20"/>
+              </w:rPr>
+              <w:t>categoricals</w:t>
+            </w:r>
+            <w:proofErr w:type="spellEnd"/>
+            <w:r>
+              <w:rPr>
+                <w:color w:val="000000"/>
+                <w:sz w:val="20"/>
+                <w:szCs w:val="20"/>
+              </w:rPr>
+              <w:t xml:space="preserve"> (</w:t>
+            </w:r>
+            <w:proofErr w:type="spellStart"/>
+            <w:r>
+              <w:rPr>
+                <w:color w:val="000000"/>
+                <w:sz w:val="20"/>
+                <w:szCs w:val="20"/>
+              </w:rPr>
+              <w:t>Weather_Condition</w:t>
+            </w:r>
+            <w:proofErr w:type="spellEnd"/>
+            <w:r>
+              <w:rPr>
+                <w:color w:val="000000"/>
+                <w:sz w:val="20"/>
+                <w:szCs w:val="20"/>
+              </w:rPr>
+              <w:t xml:space="preserve"> has 100+ values)</w:t>
             </w:r>
           </w:p>
         </w:tc>
@@ -6474,13 +6954,23 @@
             <w:pPr>
               <w:jc w:val="center"/>
             </w:pPr>
-            <w:r>
-              <w:rPr>
-                <w:color w:val="000000"/>
-                <w:sz w:val="20"/>
-                <w:szCs w:val="20"/>
-              </w:rPr>
-              <w:t>CatBoost uses ordered target encoding internally; no pre-encoding</w:t>
+            <w:proofErr w:type="spellStart"/>
+            <w:r>
+              <w:rPr>
+                <w:color w:val="000000"/>
+                <w:sz w:val="20"/>
+                <w:szCs w:val="20"/>
+              </w:rPr>
+              <w:t>CatBoost</w:t>
+            </w:r>
+            <w:proofErr w:type="spellEnd"/>
+            <w:r>
+              <w:rPr>
+                <w:color w:val="000000"/>
+                <w:sz w:val="20"/>
+                <w:szCs w:val="20"/>
+              </w:rPr>
+              <w:t xml:space="preserve"> uses ordered target encoding internally; no pre-encoding</w:t>
             </w:r>
           </w:p>
         </w:tc>
@@ -6526,7 +7016,31 @@
         <w:rPr>
           <w:color w:val="000000"/>
         </w:rPr>
-        <w:t xml:space="preserve"> a random 80/20 split mixes records from the same time periods across train and test. A time-based split (e.g., train on 2016–2021, test on 2022–2023) would give a more realistic evaluation.</w:t>
+        <w:t xml:space="preserve"> a random 80/20 split mixes records from the same time periods across train and test. A time-based split (e.g., train on 2016</w:t>
+      </w:r>
+      <w:r>
+        <w:rPr>
+          <w:color w:val="000000"/>
+        </w:rPr>
+        <w:t xml:space="preserve"> to </w:t>
+      </w:r>
+      <w:r>
+        <w:rPr>
+          <w:color w:val="000000"/>
+        </w:rPr>
+        <w:t>2021, test on 2022</w:t>
+      </w:r>
+      <w:r>
+        <w:rPr>
+          <w:color w:val="000000"/>
+        </w:rPr>
+        <w:t xml:space="preserve"> to </w:t>
+      </w:r>
+      <w:r>
+        <w:rPr>
+          <w:color w:val="000000"/>
+        </w:rPr>
+        <w:t>2023) would give a more realistic evaluation.</w:t>
       </w:r>
     </w:p>
     <w:p>
@@ -6568,13 +7082,23 @@
         </w:numPr>
         <w:spacing w:before="60" w:after="60"/>
       </w:pPr>
+      <w:proofErr w:type="spellStart"/>
       <w:r>
         <w:rPr>
           <w:b/>
           <w:bCs/>
           <w:color w:val="000000"/>
         </w:rPr>
-        <w:t>Timezone as geographic proxy</w:t>
+        <w:t>Timezone</w:t>
+      </w:r>
+      <w:proofErr w:type="spellEnd"/>
+      <w:r>
+        <w:rPr>
+          <w:b/>
+          <w:bCs/>
+          <w:color w:val="000000"/>
+        </w:rPr>
+        <w:t xml:space="preserve"> as geographic proxy</w:t>
       </w:r>
       <w:r>
         <w:rPr>
@@ -6586,7 +7110,21 @@
         <w:rPr>
           <w:color w:val="000000"/>
         </w:rPr>
-        <w:t>in the no-geography model, Timezone jumps to 25.5% importance. This is essentially a coarse location signal; it is interpretable but not a causal driver.</w:t>
+        <w:t xml:space="preserve">in the no-geography model, </w:t>
+      </w:r>
+      <w:proofErr w:type="spellStart"/>
+      <w:r>
+        <w:rPr>
+          <w:color w:val="000000"/>
+        </w:rPr>
+        <w:t>Timezone</w:t>
+      </w:r>
+      <w:proofErr w:type="spellEnd"/>
+      <w:r>
+        <w:rPr>
+          <w:color w:val="000000"/>
+        </w:rPr>
+        <w:t xml:space="preserve"> jumps to 25.5% importance. This is essentially a coarse location signal; it is interpretable but not a causal driver.</w:t>
       </w:r>
     </w:p>
     <w:p>
@@ -6646,7 +7184,21 @@
         <w:rPr>
           <w:color w:val="000000"/>
         </w:rPr>
-        <w:t xml:space="preserve"> CatBoost probabilities are not explicitly calibrated. Platt scaling or isotonic regression could improve threshold selection consistency.</w:t>
+        <w:t xml:space="preserve"> </w:t>
+      </w:r>
+      <w:proofErr w:type="spellStart"/>
+      <w:r>
+        <w:rPr>
+          <w:color w:val="000000"/>
+        </w:rPr>
+        <w:t>CatBoost</w:t>
+      </w:r>
+      <w:proofErr w:type="spellEnd"/>
+      <w:r>
+        <w:rPr>
+          <w:color w:val="000000"/>
+        </w:rPr>
+        <w:t xml:space="preserve"> probabilities are not explicitly calibrated. Platt scaling or isotonic regression could improve threshold selection consistency.</w:t>
       </w:r>
     </w:p>
     <w:sectPr>
@@ -6791,7 +7343,27 @@
         <w:sz w:val="18"/>
         <w:szCs w:val="18"/>
       </w:rPr>
-      <w:t>US Car Accidents — Severity Prediction</w:t>
+      <w:t xml:space="preserve">US Car Accidents </w:t>
+    </w:r>
+    <w:r>
+      <w:rPr>
+        <w:b/>
+        <w:bCs/>
+        <w:color w:val="2E75B6"/>
+        <w:sz w:val="18"/>
+        <w:szCs w:val="18"/>
+      </w:rPr>
+      <w:t>-</w:t>
+    </w:r>
+    <w:r>
+      <w:rPr>
+        <w:b/>
+        <w:bCs/>
+        <w:color w:val="2E75B6"/>
+        <w:sz w:val="18"/>
+        <w:szCs w:val="18"/>
+      </w:rPr>
+      <w:t xml:space="preserve"> Severity Prediction</w:t>
     </w:r>
     <w:r>
       <w:rPr>
@@ -7545,6 +8117,48 @@
       <w:szCs w:val="20"/>
     </w:rPr>
   </w:style>
+  <w:style w:type="paragraph" w:styleId="Header">
+    <w:name w:val="header"/>
+    <w:basedOn w:val="Normal"/>
+    <w:link w:val="HeaderChar"/>
+    <w:uiPriority w:val="99"/>
+    <w:unhideWhenUsed/>
+    <w:rsid w:val="003062CA"/>
+    <w:pPr>
+      <w:tabs>
+        <w:tab w:val="center" w:pos="4680"/>
+        <w:tab w:val="right" w:pos="9360"/>
+      </w:tabs>
+    </w:pPr>
+  </w:style>
+  <w:style w:type="character" w:customStyle="1" w:styleId="HeaderChar">
+    <w:name w:val="Header Char"/>
+    <w:basedOn w:val="DefaultParagraphFont"/>
+    <w:link w:val="Header"/>
+    <w:uiPriority w:val="99"/>
+    <w:rsid w:val="003062CA"/>
+  </w:style>
+  <w:style w:type="paragraph" w:styleId="Footer">
+    <w:name w:val="footer"/>
+    <w:basedOn w:val="Normal"/>
+    <w:link w:val="FooterChar"/>
+    <w:uiPriority w:val="99"/>
+    <w:unhideWhenUsed/>
+    <w:rsid w:val="003062CA"/>
+    <w:pPr>
+      <w:tabs>
+        <w:tab w:val="center" w:pos="4680"/>
+        <w:tab w:val="right" w:pos="9360"/>
+      </w:tabs>
+    </w:pPr>
+  </w:style>
+  <w:style w:type="character" w:customStyle="1" w:styleId="FooterChar">
+    <w:name w:val="Footer Char"/>
+    <w:basedOn w:val="DefaultParagraphFont"/>
+    <w:link w:val="Footer"/>
+    <w:uiPriority w:val="99"/>
+    <w:rsid w:val="003062CA"/>
+  </w:style>
 </w:styles>
 </file>
 

</xml_diff>